<commit_message>
Update project documentation with corrected role descriptions
Key corrections:
- MenuAdmin (React Native) is for the business owner ONLY, not staff
- Staff uses the web-based staff.html dashboard at their stations
- app.html described as a "chameleon" that inherits UI from the running menu
- Added planned business portfolio features (analytics, income, inventory)
- Updated all sections, data flows, and epics to reflect correct roles
- Updated corresponding Notion documents (01, 06, 00)

https://claude.ai/code/session_012EnbcGysqnXYyyDPBp4QjE
</commit_message>
<xml_diff>
--- a/QR_Menu_Platform_Documentation.docx
+++ b/QR_Menu_Platform_Documentation.docx
@@ -139,7 +139,7 @@
         <w:pStyle w:val="ListNumber"/>
       </w:pPr>
       <w:r>
-        <w:t>9. Admin Mobile Application (React Native)</w:t>
+        <w:t>9. Business Owner Mobile Application (MenuAdmin)</w:t>
       </w:r>
     </w:p>
     <w:p>
@@ -199,12 +199,12 @@
     </w:p>
     <w:p>
       <w:r>
-        <w:t>This project is a B2B2C Serverless Microservices platform designed for the hospitality industry. It bridges the gap between customer convenience and restaurant operational efficiency. Customers scan a QR code at their table to view a digital menu and place orders directly from their mobile browser. Concurrently, restaurant staff use a dedicated cross-platform mobile application (the Admin App) to manage incoming orders, claim tables, and route items to specific preparation stations (Bar, Kitchen) in real-time.</w:t>
-      </w:r>
-    </w:p>
-    <w:p>
-      <w:r>
-        <w:t>The platform goes beyond a simple QR menu viewer — it functions as a lightweight POS/RMS (Point of Sale / Restaurant Management System) with intelligent order routing, table management, and multi-role staff support.</w:t>
+        <w:t>This project is a B2B2C Serverless Microservices platform designed for the hospitality industry. It bridges the gap between customer convenience and restaurant operational efficiency. Customers scan a QR code at their table to view a digital menu and place orders directly from their mobile browser. Restaurant staff use a web-based dashboard (staff.html) to view and process orders at their respective stations (Bar, Kitchen). Meanwhile, the business owner manages the restaurant through a dedicated React Native mobile app (MenuAdmin).</w:t>
+      </w:r>
+    </w:p>
+    <w:p>
+      <w:r>
+        <w:t>The platform goes beyond a simple QR menu viewer — it functions as a lightweight POS/RMS (Point of Sale / Restaurant Management System) with intelligent order routing, station-based displays, and a dedicated business management app for the owner.</w:t>
       </w:r>
     </w:p>
     <w:p>
@@ -260,7 +260,23 @@
         <w:pStyle w:val="ListBullet"/>
       </w:pPr>
       <w:r>
-        <w:t>Dynamic menu management via dedicated mobile Admin App</w:t>
+        <w:t>Dynamic menu management via dedicated mobile app for the business owner (MenuAdmin)</w:t>
+      </w:r>
+    </w:p>
+    <w:p>
+      <w:pPr>
+        <w:pStyle w:val="ListBullet"/>
+      </w:pPr>
+      <w:r>
+        <w:t>Web-based staff dashboard (staff.html) for preparation stations</w:t>
+      </w:r>
+    </w:p>
+    <w:p>
+      <w:pPr>
+        <w:pStyle w:val="ListBullet"/>
+      </w:pPr>
+      <w:r>
+        <w:t>Planned business portfolio: analytics, income/expenses, inventory management</w:t>
       </w:r>
     </w:p>
     <w:p>
@@ -296,7 +312,7 @@
     </w:p>
     <w:p>
       <w:r>
-        <w:t>The customer scans a QR code placed at their table. This opens a static web application in their mobile browser. They browse the shop-specific menu, add items to a cart (managed via Local Storage), enter their table number, and submit the order. The order is sent as a POST request to the AWS API Gateway, which invokes the CreateOrderHandler Lambda function. The order source is tagged as CUSTOMER_QR.</w:t>
+        <w:t>The customer scans a QR code placed at their table. This opens a static web application in their mobile browser showing the shop-specific menu. When they are ready to order, they press the "START ORDER" button embedded in the menu UI. This redirects them to app.html — a "chameleon" ordering page that inherits UI elements (theme, colors, branding) from the currently running menu. There, they enter their table number, build their order, and submit it. The order is sent as a POST request to the AWS API Gateway, which invokes the CreateOrderHandler Lambda function. The order source is tagged as CUSTOMER_QR.</w:t>
       </w:r>
     </w:p>
     <w:p>
@@ -304,12 +320,38 @@
         <w:pStyle w:val="Heading2"/>
       </w:pPr>
       <w:r>
-        <w:t>2.2 Staff — Role A: SERVICE (Waiters)</w:t>
-      </w:r>
-    </w:p>
-    <w:p>
-      <w:r>
-        <w:t>Upon logging in to the React Native Admin App, the waiter selects the "SERVICE" role. They see:</w:t>
+        <w:t>2.2 Staff (Web — staff.html)</w:t>
+      </w:r>
+    </w:p>
+    <w:p>
+      <w:r>
+        <w:t>Staff members use a web-based dashboard (staff.html in qr-menu-orders-environments), NOT the React Native mobile app. The dashboard is accessed via a browser and is designed for display screens at preparation stations.</w:t>
+      </w:r>
+    </w:p>
+    <w:p>
+      <w:pPr>
+        <w:pStyle w:val="Heading3"/>
+      </w:pPr>
+      <w:r>
+        <w:t>2.2.1 Station: BAR &amp; KITCHEN</w:t>
+      </w:r>
+    </w:p>
+    <w:p>
+      <w:r>
+        <w:t>Each preparation station (Bar, Kitchen) opens staff.html filtered by their station. They see only the orders relevant to them — the Bar sees items where station equals "BAR", the Kitchen sees items where station equals "KITCHEN". When an item is prepared, they press "MARK AS DONE", which sends a PATCH request to UpdateOrderStatusHandler. If all items across all stations are done, the parent order transitions to READY.</w:t>
+      </w:r>
+    </w:p>
+    <w:p>
+      <w:pPr>
+        <w:pStyle w:val="Heading3"/>
+      </w:pPr>
+      <w:r>
+        <w:t>2.2.2 Waiter / Service Role</w:t>
+      </w:r>
+    </w:p>
+    <w:p>
+      <w:r>
+        <w:t>The waiter role (planned) will also use the web-based dashboard with the following features:</w:t>
       </w:r>
     </w:p>
     <w:p>
@@ -323,7 +365,7 @@
         <w:t xml:space="preserve">Shared Pool (Dexameni): </w:t>
       </w:r>
       <w:r>
-        <w:t xml:space="preserve">Shared Pool: </w:t>
+        <w:t>All NEW, unassigned customer orders waiting to be claimed.</w:t>
       </w:r>
     </w:p>
     <w:p>
@@ -331,7 +373,13 @@
         <w:pStyle w:val="ListBullet"/>
       </w:pPr>
       <w:r>
-        <w:t>All NEW, unassigned customer orders waiting to be claimed.</w:t>
+        <w:rPr>
+          <w:b/>
+        </w:rPr>
+        <w:t xml:space="preserve">Claiming: </w:t>
+      </w:r>
+      <w:r>
+        <w:t>The waiter presses "ANALIPSI" (Claim) to take ownership of an order. This sets claimedBy to their name and status to CLAIMED.</w:t>
       </w:r>
     </w:p>
     <w:p>
@@ -339,7 +387,13 @@
         <w:pStyle w:val="ListBullet"/>
       </w:pPr>
       <w:r>
-        <w:t>Claiming mechanism: The waiter presses "ANALIPSI" (Claim) to take ownership of an order. This sets claimedBy to their name and status to CLAIMED.</w:t>
+        <w:rPr>
+          <w:b/>
+        </w:rPr>
+        <w:t xml:space="preserve">Floor Plan: </w:t>
+      </w:r>
+      <w:r>
+        <w:t>A grid view of tables — Green (my tables), Red (other waiters' tables), Grey (empty).</w:t>
       </w:r>
     </w:p>
     <w:p>
@@ -347,7 +401,26 @@
         <w:pStyle w:val="ListBullet"/>
       </w:pPr>
       <w:r>
-        <w:t>Floor Plan: A grid view of tables — Green (my tables), Red (other waiters' tables), Grey (empty).</w:t>
+        <w:rPr>
+          <w:b/>
+        </w:rPr>
+        <w:t xml:space="preserve">Actions: </w:t>
+      </w:r>
+      <w:r>
+        <w:t>Can create new orders directly (source: WAITER_PDA), append items to existing active tables, and mark tables as Paid/Closed.</w:t>
+      </w:r>
+    </w:p>
+    <w:p>
+      <w:pPr>
+        <w:pStyle w:val="Heading2"/>
+      </w:pPr>
+      <w:r>
+        <w:t>2.3 Business Owner (React Native App — MenuAdmin)</w:t>
+      </w:r>
+    </w:p>
+    <w:p>
+      <w:r>
+        <w:t>The business owner uses the React Native mobile app (MenuAdmin). Staff members do NOT have access to this application. Currently, the app provides full menu management (CRUD for categories, products, prices, descriptions). It is planned to evolve into a complete business portfolio with the following features:</w:t>
       </w:r>
     </w:p>
     <w:p>
@@ -355,33 +428,69 @@
         <w:pStyle w:val="ListBullet"/>
       </w:pPr>
       <w:r>
-        <w:t>Can create new orders directly (source: WAITER_PDA), append items to existing active tables, and mark tables as Paid/Closed.</w:t>
-      </w:r>
-    </w:p>
-    <w:p>
-      <w:pPr>
-        <w:pStyle w:val="Heading2"/>
-      </w:pPr>
-      <w:r>
-        <w:t>2.3 Staff — Role B: BAR</w:t>
-      </w:r>
-    </w:p>
-    <w:p>
-      <w:r>
-        <w:t>The bartender logs in and selects the "BAR" role. They see a filtered view that only displays items from CLAIMED or PARTIAL orders where the item's station field equals "BAR". When a drink is prepared, they press "DONE" on that specific item, which sends an ITEM_DONE action to UpdateOrderStatusHandler. If all items across all stations are done, the parent order transitions to READY.</w:t>
-      </w:r>
-    </w:p>
-    <w:p>
-      <w:pPr>
-        <w:pStyle w:val="Heading2"/>
-      </w:pPr>
-      <w:r>
-        <w:t>2.4 Staff — Role C: KITCHEN</w:t>
-      </w:r>
-    </w:p>
-    <w:p>
-      <w:r>
-        <w:t>Identical to the Bar role, but the Kitchen only sees items where station equals "KITCHEN". The same ITEM_DONE -&gt; READY lifecycle applies.</w:t>
+        <w:rPr>
+          <w:b/>
+        </w:rPr>
+        <w:t xml:space="preserve">Order Analytics: </w:t>
+      </w:r>
+      <w:r>
+        <w:t>Statistics on orders, peak hours, average order value</w:t>
+      </w:r>
+    </w:p>
+    <w:p>
+      <w:pPr>
+        <w:pStyle w:val="ListBullet"/>
+      </w:pPr>
+      <w:r>
+        <w:rPr>
+          <w:b/>
+        </w:rPr>
+        <w:t xml:space="preserve">Top Products: </w:t>
+      </w:r>
+      <w:r>
+        <w:t>Most popular items, best sellers by category</w:t>
+      </w:r>
+    </w:p>
+    <w:p>
+      <w:pPr>
+        <w:pStyle w:val="ListBullet"/>
+      </w:pPr>
+      <w:r>
+        <w:rPr>
+          <w:b/>
+        </w:rPr>
+        <w:t xml:space="preserve">Income &amp; Expenses: </w:t>
+      </w:r>
+      <w:r>
+        <w:t>Revenue tracking, cost management, profit margins</w:t>
+      </w:r>
+    </w:p>
+    <w:p>
+      <w:pPr>
+        <w:pStyle w:val="ListBullet"/>
+      </w:pPr>
+      <w:r>
+        <w:rPr>
+          <w:b/>
+        </w:rPr>
+        <w:t xml:space="preserve">Inventory / Storage (Kava): </w:t>
+      </w:r>
+      <w:r>
+        <w:t>Stock management for the restaurant, cafe, and bar. Track supplies, set low-stock alerts.</w:t>
+      </w:r>
+    </w:p>
+    <w:p>
+      <w:pPr>
+        <w:pStyle w:val="ListBullet"/>
+      </w:pPr>
+      <w:r>
+        <w:rPr>
+          <w:b/>
+        </w:rPr>
+        <w:t xml:space="preserve">General Business Organization: </w:t>
+      </w:r>
+      <w:r>
+        <w:t>A comprehensive system for managing all operational needs of the business</w:t>
       </w:r>
     </w:p>
     <w:p>
@@ -535,7 +644,7 @@
           </w:tcPr>
           <w:p>
             <w:r>
-              <w:t>Admin Dashboard (Mobile)</w:t>
+              <w:t>Business Owner App (Mobile)</w:t>
             </w:r>
           </w:p>
         </w:tc>
@@ -636,7 +745,7 @@
     </w:p>
     <w:p>
       <w:r>
-        <w:t>The flow works as follows: (1) The Customer opens the static menu website hosted on S3/CloudFront. (2) They browse the menu by fetching data from the GetMenuHandler Lambda via API Gateway. (3) Upon order submission, a POST hits CreateOrderHandler, which writes to DynamoDB with status=NEW. (4) The Admin mobile app polls GetOrdersHandler every few seconds. (5) The waiter claims the order via UpdateOrderStatusHandler (action=CLAIM). (6) Bar/Kitchen stations see their filtered items and mark them done (action=ITEM_DONE). (7) When all items are done, the order becomes READY and the waiter is notified. (8) The waiter closes the order (action=CLOSE) after payment.</w:t>
+        <w:t>The flow works as follows: (1) The Customer opens the static menu website hosted on S3/CloudFront. (2) They browse the menu by fetching data from the GetMenuHandler Lambda via API Gateway. (3) They press "START ORDER" and are redirected to app.html, a chameleon page that inherits the menu's UI theme. (4) Upon order submission, a POST hits CreateOrderHandler, which writes to DynamoDB with status=NEW. (5) The staff dashboard (staff.html) polls GetOrdersHandler and displays orders per station. (6) Bar/Kitchen stations see their filtered items and mark them done (action=ITEM_DONE). (7) When all items are done, the order becomes READY and the waiter is notified. (8) The waiter closes the order (action=CLOSE) after payment. Separately, the business owner uses the MenuAdmin React Native app to manage the menu and (in the future) view analytics, track income/expenses, and manage inventory.</w:t>
       </w:r>
     </w:p>
     <w:p>
@@ -2007,12 +2116,12 @@
         <w:pStyle w:val="Heading2"/>
       </w:pPr>
       <w:r>
-        <w:t>7.3 Feature Flags — Customer Ordering Widget</w:t>
-      </w:r>
-    </w:p>
-    <w:p>
-      <w:r>
-        <w:t>The template checks if the shop has the customerOrdering feature enabled (data.features.customerOrdering === true). If so, a "START ORDER" button is dynamically injected into the page. This button redirects to the ordering web app (app.html in qr-menu-orders-environments) hosted on a separate S3 bucket, passing the shopId as a query parameter.</w:t>
+        <w:t>7.3 Feature Flags — START ORDER Button</w:t>
+      </w:r>
+    </w:p>
+    <w:p>
+      <w:r>
+        <w:t>The template checks if the shop has the customerOrdering feature enabled (data.features.customerOrdering === true). If so, a "START ORDER" button is dynamically injected into the menu page UI. This button is the entry point to the ordering flow — it redirects the customer to app.html (in qr-menu-orders-environments), a "chameleon" HTML page that inherits UI elements (theme colors, branding) from the currently running menu. The shopId is passed as a query parameter so app.html knows which shop's menu and theme to load.</w:t>
       </w:r>
     </w:p>
     <w:p>
@@ -2043,12 +2152,12 @@
         <w:pStyle w:val="Heading2"/>
       </w:pPr>
       <w:r>
-        <w:t>8.1 Customer Ordering App (app.html)</w:t>
-      </w:r>
-    </w:p>
-    <w:p>
-      <w:r>
-        <w:t>A self-contained, single-page ordering application. It fetches the shop's menu from the Java GetMenuHandler Lambda (GET /menu?shopId=...) and renders a clean, animated product listing. The customer enters their table number, adds items to cart, and submits the order as a POST to /orders on the API Gateway. Features a light/dark theme system driven by shop settings, smooth slide-up animations, and a slide-up cart overlay panel.</w:t>
+        <w:t>8.1 Customer Ordering App (app.html) — The Chameleon</w:t>
+      </w:r>
+    </w:p>
+    <w:p>
+      <w:r>
+        <w:t>A self-contained, single-page ordering application that acts as a "chameleon" — it dynamically inherits UI elements (theme colors, branding, light/dark mode) from the shop's menu that the customer was browsing. When the customer presses "START ORDER" on the menu page, they are redirected here with the shopId as a query parameter. app.html fetches the shop's menu from the Java GetMenuHandler Lambda (GET /menu?shopId=...), applies the shop's theme settings (primaryColor, themeMode), and renders a clean, animated product listing. The customer enters their table number, adds items to cart, and submits the order as a POST to /orders on the API Gateway. Features smooth slide-up animations and a slide-up cart overlay panel.</w:t>
       </w:r>
     </w:p>
     <w:p>
@@ -2162,12 +2271,12 @@
         <w:pStyle w:val="Heading2"/>
       </w:pPr>
       <w:r>
-        <w:t>8.2 Kitchen Display System (staff.html)</w:t>
-      </w:r>
-    </w:p>
-    <w:p>
-      <w:r>
-        <w:t>A real-time dashboard designed for kitchen/bar display screens. It polls the GetOrdersHandler (GET /orders?shopId=...) every 10 seconds and renders only NEW orders as cards in a responsive grid. Each card shows the table number, timestamp, and ordered items with quantities. Staff can press "MARK AS DONE" to send a PATCH request to UpdateOrderStatusHandler, which transitions the order to COMPLETED. The card then fades out of the grid.</w:t>
+        <w:t>8.2 Staff Dashboard (staff.html)</w:t>
+      </w:r>
+    </w:p>
+    <w:p>
+      <w:r>
+        <w:t>This is the staff's primary interface — a real-time web-based dashboard designed for display screens at preparation stations (Bar, Kitchen). Staff do NOT use the React Native mobile app; they use this browser-based dashboard. Each station opens staff.html and sees only the orders relevant to their post. The dashboard polls the GetOrdersHandler (GET /orders?shopId=...) every 10 seconds and renders NEW orders as cards in a responsive grid. Each card shows the table number, timestamp, and ordered items with quantities. Staff press "MARK AS DONE" to send a PATCH request to UpdateOrderStatusHandler, which transitions the order to COMPLETED. The card then fades out of the grid.</w:t>
       </w:r>
     </w:p>
     <w:p>
@@ -2262,7 +2371,7 @@
         <w:pStyle w:val="Heading1"/>
       </w:pPr>
       <w:r>
-        <w:t>9. Admin Mobile Application (Staff Dashboard)</w:t>
+        <w:t>9. Business Owner Mobile Application (MenuAdmin)</w:t>
       </w:r>
     </w:p>
     <w:p>
@@ -2272,7 +2381,7 @@
           <w:color w:val="555555"/>
           <w:sz w:val="20"/>
         </w:rPr>
-        <w:t>Notion Source: 06_Mobile_App_Staff — Repository: MenuAdmin</w:t>
+        <w:t>Notion Source: 06_Mobile_App_Business_Owner — Repository: MenuAdmin</w:t>
       </w:r>
     </w:p>
     <w:p>
@@ -2389,7 +2498,7 @@
     </w:p>
     <w:p>
       <w:r>
-        <w:t>The main screen of the admin app. Currently implements menu management functionality (CRUD for categories and products). It operates with three view modes: LIST (default accordion view of categories/products), EDIT_CAT (edit/create category form), and EDIT_PROD (edit/create product form). Key behaviors:</w:t>
+        <w:t>The main screen of the business owner app. Currently implements menu management functionality (CRUD for categories and products). It operates with three view modes: LIST (default accordion view of categories/products), EDIT_CAT (edit/create category form), and EDIT_PROD (edit/create product form). Key behaviors:</w:t>
       </w:r>
     </w:p>
     <w:p>
@@ -2433,16 +2542,64 @@
       </w:r>
     </w:p>
     <w:p>
-      <w:r>
-        <w:t>Per Epic 3, this screen will be extended to include order management views: Shared Pool, Floor Plan, and station-filtered order lists for Bar/Kitchen roles. The UI will filter the GetOrdersHandler JSON response based on the selected role (e.g., Bar maps only items with station === "BAR").</w:t>
-      </w:r>
-    </w:p>
-    <w:p>
       <w:pPr>
         <w:pStyle w:val="Heading2"/>
       </w:pPr>
       <w:r>
-        <w:t>9.5 API Service Layer — api.js</w:t>
+        <w:t>9.5 Planned Evolution — Business Portfolio</w:t>
+      </w:r>
+    </w:p>
+    <w:p>
+      <w:r>
+        <w:t>The app is planned to evolve from a simple menu editor into a comprehensive business management portfolio. Future screens and features include:</w:t>
+      </w:r>
+    </w:p>
+    <w:p>
+      <w:pPr>
+        <w:pStyle w:val="ListBullet"/>
+      </w:pPr>
+      <w:r>
+        <w:t>Order analytics dashboard: statistics, peak hours, average order value</w:t>
+      </w:r>
+    </w:p>
+    <w:p>
+      <w:pPr>
+        <w:pStyle w:val="ListBullet"/>
+      </w:pPr>
+      <w:r>
+        <w:t>Top products report: best sellers by category</w:t>
+      </w:r>
+    </w:p>
+    <w:p>
+      <w:pPr>
+        <w:pStyle w:val="ListBullet"/>
+      </w:pPr>
+      <w:r>
+        <w:t>Income &amp; expenses tracking: revenue, costs, profit margins</w:t>
+      </w:r>
+    </w:p>
+    <w:p>
+      <w:pPr>
+        <w:pStyle w:val="ListBullet"/>
+      </w:pPr>
+      <w:r>
+        <w:t>Inventory / storage (kava) management: stock tracking for restaurant, cafe, and bar with low-stock alerts</w:t>
+      </w:r>
+    </w:p>
+    <w:p>
+      <w:pPr>
+        <w:pStyle w:val="ListBullet"/>
+      </w:pPr>
+      <w:r>
+        <w:t>General business organization tools for the owner's operational needs</w:t>
+      </w:r>
+    </w:p>
+    <w:p>
+      <w:pPr>
+        <w:pStyle w:val="Heading2"/>
+      </w:pPr>
+      <w:r>
+        <w:t>9.6 API Service Layer — api.js</w:t>
       </w:r>
     </w:p>
     <w:p>
@@ -2504,7 +2661,7 @@
     </w:p>
     <w:p>
       <w:r>
-        <w:t>Per Epic 3, this service will be extended with calls to the Java API Gateway endpoints: GET /orders (polling), PATCH /orders/status (with action payloads for CLAIM, ITEM_DONE, APPEND, CLOSE).</w:t>
+        <w:t>In the future, this service may be extended with calls to the Java API Gateway endpoints for analytics and reporting (e.g., fetching order history, revenue data). Staff order management is handled via the web-based staff.html dashboard, not through this mobile app.</w:t>
       </w:r>
     </w:p>
     <w:p>
@@ -3110,7 +3267,7 @@
         <w:t xml:space="preserve">Step 3: </w:t>
       </w:r>
       <w:r>
-        <w:t>Customer clicks "START ORDER" -&gt; Redirects to app.html (qr-menu-orders-environments S3 bucket)</w:t>
+        <w:t>Customer browses the menu. Presses "START ORDER" button embedded in the menu UI</w:t>
       </w:r>
     </w:p>
     <w:p>
@@ -3124,7 +3281,7 @@
         <w:t xml:space="preserve">Step 4: </w:t>
       </w:r>
       <w:r>
-        <w:t>app.html fetches menu via Java GetMenuHandler (GET /menu?shopId=X) from DynamoDB "Menus" table</w:t>
+        <w:t>Redirected to app.html (qr-menu-orders-environments S3 bucket) — a chameleon page that inherits UI theme from the running menu</w:t>
       </w:r>
     </w:p>
     <w:p>
@@ -3138,7 +3295,7 @@
         <w:t xml:space="preserve">Step 5: </w:t>
       </w:r>
       <w:r>
-        <w:t>Customer adds items to cart (Local Storage) and enters table number</w:t>
+        <w:t>app.html fetches menu via Java GetMenuHandler (GET /menu?shopId=X) and applies the shop's theme (colors, light/dark mode)</w:t>
       </w:r>
     </w:p>
     <w:p>
@@ -3152,7 +3309,7 @@
         <w:t xml:space="preserve">Step 6: </w:t>
       </w:r>
       <w:r>
-        <w:t>Customer submits order -&gt; POST /orders hits Java CreateOrderHandler</w:t>
+        <w:t>Customer adds items to cart and enters table number</w:t>
       </w:r>
     </w:p>
     <w:p>
@@ -3166,7 +3323,7 @@
         <w:t xml:space="preserve">Step 7: </w:t>
       </w:r>
       <w:r>
-        <w:t>CreateOrderHandler generates orderId (ORDER#TIMESTAMP#UUID), sets status=NEW, writes to DynamoDB "orders" table</w:t>
+        <w:t>Customer submits order -&gt; POST /orders hits Java CreateOrderHandler</w:t>
       </w:r>
     </w:p>
     <w:p>
@@ -3180,7 +3337,21 @@
         <w:t xml:space="preserve">Step 8: </w:t>
       </w:r>
       <w:r>
-        <w:t>Order now visible to staff systems</w:t>
+        <w:t>CreateOrderHandler generates orderId (ORDER#TIMESTAMP#UUID), sets status=NEW, writes to DynamoDB "orders" table</w:t>
+      </w:r>
+    </w:p>
+    <w:p>
+      <w:pPr>
+        <w:pStyle w:val="ListBullet"/>
+      </w:pPr>
+      <w:r>
+        <w:rPr>
+          <w:b/>
+        </w:rPr>
+        <w:t xml:space="preserve">Step 9: </w:t>
+      </w:r>
+      <w:r>
+        <w:t>Order now visible on the staff dashboard (staff.html)</w:t>
       </w:r>
     </w:p>
     <w:p>
@@ -3202,7 +3373,7 @@
         <w:t xml:space="preserve">Step 1: </w:t>
       </w:r>
       <w:r>
-        <w:t>Waiter opens Admin App (MenuAdmin) -&gt; Logs in via api.login() -&gt; POST /login to Node.js Lambda</w:t>
+        <w:t>Staff opens staff.html in a browser at their preparation station (Bar or Kitchen)</w:t>
       </w:r>
     </w:p>
     <w:p>
@@ -3216,7 +3387,7 @@
         <w:t xml:space="preserve">Step 2: </w:t>
       </w:r>
       <w:r>
-        <w:t>MenuDashboard polls GetOrdersHandler (GET /orders?shopId=X) -&gt; Gets all orders from DynamoDB</w:t>
+        <w:t>staff.html polls GetOrdersHandler (GET /orders?shopId=X) every 10 seconds -&gt; Gets all orders from DynamoDB</w:t>
       </w:r>
     </w:p>
     <w:p>
@@ -3230,7 +3401,7 @@
         <w:t xml:space="preserve">Step 3: </w:t>
       </w:r>
       <w:r>
-        <w:t>Waiter sees NEW orders in Shared Pool -&gt; Presses "CLAIM" -&gt; PATCH /orders/status with action=CLAIM</w:t>
+        <w:t>Each station sees only orders filtered by their station field (BAR/KITCHEN)</w:t>
       </w:r>
     </w:p>
     <w:p>
@@ -3244,7 +3415,7 @@
         <w:t xml:space="preserve">Step 4: </w:t>
       </w:r>
       <w:r>
-        <w:t>UpdateOrderStatusHandler sets claimedBy=waiterName, status=CLAIMED</w:t>
+        <w:t>Station staff marks items done -&gt; PATCH /orders/status transitions order status</w:t>
       </w:r>
     </w:p>
     <w:p>
@@ -3258,7 +3429,7 @@
         <w:t xml:space="preserve">Step 5: </w:t>
       </w:r>
       <w:r>
-        <w:t>Bar/Kitchen roles see CLAIMED orders filtered by station field (BAR/KITCHEN)</w:t>
+        <w:t>When all items across all stations are DONE -&gt; parent status becomes READY</w:t>
       </w:r>
     </w:p>
     <w:p>
@@ -3272,7 +3443,99 @@
         <w:t xml:space="preserve">Step 6: </w:t>
       </w:r>
       <w:r>
-        <w:t>Station staff marks item done -&gt; PATCH /orders/status with action=ITEM_DONE, productId=X</w:t>
+        <w:t>Waiter delivers the order and closes it after payment -&gt; status=CLOSED, paymentStatus=PAID</w:t>
+      </w:r>
+    </w:p>
+    <w:p>
+      <w:pPr>
+        <w:pStyle w:val="Heading2"/>
+      </w:pPr>
+      <w:r>
+        <w:t>12.3 Menu Management Flow</w:t>
+      </w:r>
+    </w:p>
+    <w:p>
+      <w:pPr>
+        <w:pStyle w:val="ListBullet"/>
+      </w:pPr>
+      <w:r>
+        <w:rPr>
+          <w:b/>
+        </w:rPr>
+        <w:t xml:space="preserve">Step 1: </w:t>
+      </w:r>
+      <w:r>
+        <w:t>Business owner opens MenuAdmin app on their phone -&gt; Logs in with Shop ID and Password</w:t>
+      </w:r>
+    </w:p>
+    <w:p>
+      <w:pPr>
+        <w:pStyle w:val="ListBullet"/>
+      </w:pPr>
+      <w:r>
+        <w:rPr>
+          <w:b/>
+        </w:rPr>
+        <w:t xml:space="preserve">Step 2: </w:t>
+      </w:r>
+      <w:r>
+        <w:t>MenuDashboard calls api.getMenuData() -&gt; POST /get-data to Node.js Lambda</w:t>
+      </w:r>
+    </w:p>
+    <w:p>
+      <w:pPr>
+        <w:pStyle w:val="ListBullet"/>
+      </w:pPr>
+      <w:r>
+        <w:rPr>
+          <w:b/>
+        </w:rPr>
+        <w:t xml:space="preserve">Step 3: </w:t>
+      </w:r>
+      <w:r>
+        <w:t>Node.js Lambda reads from DynamoDB "Menus" table and returns menu JSON</w:t>
+      </w:r>
+    </w:p>
+    <w:p>
+      <w:pPr>
+        <w:pStyle w:val="ListBullet"/>
+      </w:pPr>
+      <w:r>
+        <w:rPr>
+          <w:b/>
+        </w:rPr>
+        <w:t xml:space="preserve">Step 4: </w:t>
+      </w:r>
+      <w:r>
+        <w:t>Owner adds/edits/deletes categories or products in the UI</w:t>
+      </w:r>
+    </w:p>
+    <w:p>
+      <w:pPr>
+        <w:pStyle w:val="ListBullet"/>
+      </w:pPr>
+      <w:r>
+        <w:rPr>
+          <w:b/>
+        </w:rPr>
+        <w:t xml:space="preserve">Step 5: </w:t>
+      </w:r>
+      <w:r>
+        <w:t>On save, api.saveMenuData() -&gt; POST /save-data to Node.js Lambda</w:t>
+      </w:r>
+    </w:p>
+    <w:p>
+      <w:pPr>
+        <w:pStyle w:val="ListBullet"/>
+      </w:pPr>
+      <w:r>
+        <w:rPr>
+          <w:b/>
+        </w:rPr>
+        <w:t xml:space="preserve">Step 6: </w:t>
+      </w:r>
+      <w:r>
+        <w:t>Node.js Lambda writes the complete updated JSON back to DynamoDB (PutCommand)</w:t>
       </w:r>
     </w:p>
     <w:p>
@@ -3286,141 +3549,7 @@
         <w:t xml:space="preserve">Step 7: </w:t>
       </w:r>
       <w:r>
-        <w:t>Handler sets specific item's itemStatus=DONE. If ALL items DONE -&gt; parent status becomes READY</w:t>
-      </w:r>
-    </w:p>
-    <w:p>
-      <w:pPr>
-        <w:pStyle w:val="ListBullet"/>
-      </w:pPr>
-      <w:r>
-        <w:rPr>
-          <w:b/>
-        </w:rPr>
-        <w:t xml:space="preserve">Step 8: </w:t>
-      </w:r>
-      <w:r>
-        <w:t>Waiter sees READY notification -&gt; Delivers food -&gt; Presses "CLOSE" after payment</w:t>
-      </w:r>
-    </w:p>
-    <w:p>
-      <w:pPr>
-        <w:pStyle w:val="ListBullet"/>
-      </w:pPr>
-      <w:r>
-        <w:rPr>
-          <w:b/>
-        </w:rPr>
-        <w:t xml:space="preserve">Step 9: </w:t>
-      </w:r>
-      <w:r>
-        <w:t>Handler sets status=CLOSED, paymentStatus=PAID. Order archived.</w:t>
-      </w:r>
-    </w:p>
-    <w:p>
-      <w:pPr>
-        <w:pStyle w:val="Heading2"/>
-      </w:pPr>
-      <w:r>
-        <w:t>12.3 Menu Management Flow</w:t>
-      </w:r>
-    </w:p>
-    <w:p>
-      <w:pPr>
-        <w:pStyle w:val="ListBullet"/>
-      </w:pPr>
-      <w:r>
-        <w:rPr>
-          <w:b/>
-        </w:rPr>
-        <w:t xml:space="preserve">Step 1: </w:t>
-      </w:r>
-      <w:r>
-        <w:t>Admin opens MenuAdmin app -&gt; Logs in</w:t>
-      </w:r>
-    </w:p>
-    <w:p>
-      <w:pPr>
-        <w:pStyle w:val="ListBullet"/>
-      </w:pPr>
-      <w:r>
-        <w:rPr>
-          <w:b/>
-        </w:rPr>
-        <w:t xml:space="preserve">Step 2: </w:t>
-      </w:r>
-      <w:r>
-        <w:t>MenuDashboard calls api.getMenuData() -&gt; POST /get-data to Node.js Lambda</w:t>
-      </w:r>
-    </w:p>
-    <w:p>
-      <w:pPr>
-        <w:pStyle w:val="ListBullet"/>
-      </w:pPr>
-      <w:r>
-        <w:rPr>
-          <w:b/>
-        </w:rPr>
-        <w:t xml:space="preserve">Step 3: </w:t>
-      </w:r>
-      <w:r>
-        <w:t>Node.js Lambda reads from DynamoDB "Menus" table and returns menu JSON</w:t>
-      </w:r>
-    </w:p>
-    <w:p>
-      <w:pPr>
-        <w:pStyle w:val="ListBullet"/>
-      </w:pPr>
-      <w:r>
-        <w:rPr>
-          <w:b/>
-        </w:rPr>
-        <w:t xml:space="preserve">Step 4: </w:t>
-      </w:r>
-      <w:r>
-        <w:t>Admin adds/edits/deletes categories or products in the UI</w:t>
-      </w:r>
-    </w:p>
-    <w:p>
-      <w:pPr>
-        <w:pStyle w:val="ListBullet"/>
-      </w:pPr>
-      <w:r>
-        <w:rPr>
-          <w:b/>
-        </w:rPr>
-        <w:t xml:space="preserve">Step 5: </w:t>
-      </w:r>
-      <w:r>
-        <w:t>On save, api.saveMenuData() -&gt; POST /save-data to Node.js Lambda</w:t>
-      </w:r>
-    </w:p>
-    <w:p>
-      <w:pPr>
-        <w:pStyle w:val="ListBullet"/>
-      </w:pPr>
-      <w:r>
-        <w:rPr>
-          <w:b/>
-        </w:rPr>
-        <w:t xml:space="preserve">Step 6: </w:t>
-      </w:r>
-      <w:r>
-        <w:t>Node.js Lambda writes the complete updated JSON back to DynamoDB (PutCommand)</w:t>
-      </w:r>
-    </w:p>
-    <w:p>
-      <w:pPr>
-        <w:pStyle w:val="ListBullet"/>
-      </w:pPr>
-      <w:r>
-        <w:rPr>
-          <w:b/>
-        </w:rPr>
-        <w:t xml:space="preserve">Step 7: </w:t>
-      </w:r>
-      <w:r>
-        <w:t>Customer frontend automatically serves updated data on next page load</w:t>
+        <w:t>Customer frontend and ordering app (app.html) automatically serve updated data on next page load</w:t>
       </w:r>
     </w:p>
     <w:p>
@@ -3519,7 +3648,7 @@
           </w:tcPr>
           <w:p>
             <w:r>
-              <w:t>Menu management, admin auth, S3 template serving</w:t>
+              <w:t>Menu management, owner auth, S3 template serving</w:t>
             </w:r>
           </w:p>
         </w:tc>
@@ -3561,7 +3690,7 @@
           </w:tcPr>
           <w:p>
             <w:r>
-              <w:t>Admin mobile app (MenuAdmin), customer template pages</w:t>
+              <w:t>Business owner mobile app (MenuAdmin), customer template pages</w:t>
             </w:r>
           </w:p>
         </w:tc>
@@ -3571,7 +3700,7 @@
           </w:tcPr>
           <w:p>
             <w:r>
-              <w:t>Customer ordering app (app.html), kitchen display (staff.html)</w:t>
+              <w:t>Customer ordering app (app.html), staff dashboard (staff.html)</w:t>
             </w:r>
           </w:p>
         </w:tc>
@@ -3707,7 +3836,7 @@
         <w:pStyle w:val="Heading2"/>
       </w:pPr>
       <w:r>
-        <w:t>Epic 3: React Native Admin App Integration</w:t>
+        <w:t>Epic 3: Business Owner App — Portfolio Evolution</w:t>
       </w:r>
     </w:p>
     <w:p>
@@ -3729,7 +3858,7 @@
         <w:pStyle w:val="ListBullet"/>
       </w:pPr>
       <w:r>
-        <w:t>Objective: Connect MenuAdmin via Axios to the Java API Gateway endpoints for real-time order management.</w:t>
+        <w:t>Objective: Evolve MenuAdmin from a menu editor into a full business management portfolio for the restaurant owner.</w:t>
       </w:r>
     </w:p>
     <w:p>
@@ -3737,7 +3866,7 @@
         <w:pStyle w:val="ListBullet"/>
       </w:pPr>
       <w:r>
-        <w:t>Impact: Gives waiters, bartenders, and cooks a unified mobile interface for managing orders.</w:t>
+        <w:t>Impact: Gives the business owner analytics, financial insights, and inventory control in a single mobile app.</w:t>
       </w:r>
     </w:p>
     <w:p>
@@ -3745,7 +3874,7 @@
         <w:pStyle w:val="ListBullet"/>
       </w:pPr>
       <w:r>
-        <w:t>Code Impact: Extend api.js with new methods for GET /orders, PATCH /orders/status. Add new screens/views to MenuDashboard.js for Shared Pool, Floor Plan, and station views. Implement polling (or WebSocket in future) for real-time updates.</w:t>
+        <w:t>Code Impact: Add new screens to MenuAdmin for order analytics, top products, income/expenses, and inventory management. Extend api.js with new methods for fetching order history and reporting data. Implement data visualization components.</w:t>
       </w:r>
     </w:p>
     <w:p>
@@ -3964,7 +4093,7 @@
         <w:pStyle w:val="Heading2"/>
       </w:pPr>
       <w:r>
-        <w:t>MenuAdmin (React Native Mobile App)</w:t>
+        <w:t>MenuAdmin (Business Owner Mobile App)</w:t>
       </w:r>
     </w:p>
     <w:p>
@@ -3988,7 +4117,7 @@
         <w:pStyle w:val="ListBullet"/>
       </w:pPr>
       <w:r>
-        <w:t>src/screens/MenuDashboard.js</w:t>
+        <w:t>src/screens/MenuDashboard.js (Menu CRUD)</w:t>
       </w:r>
     </w:p>
     <w:p>
@@ -4004,7 +4133,7 @@
         <w:pStyle w:val="Heading2"/>
       </w:pPr>
       <w:r>
-        <w:t>qr-menu-orders-environments (Ordering Web Apps)</w:t>
+        <w:t>qr-menu-orders-environments (Ordering &amp; Staff Web Apps)</w:t>
       </w:r>
     </w:p>
     <w:p>
@@ -4012,7 +4141,7 @@
         <w:pStyle w:val="ListBullet"/>
       </w:pPr>
       <w:r>
-        <w:t>app.html (Customer ordering app)</w:t>
+        <w:t>app.html (Customer ordering app — chameleon UI)</w:t>
       </w:r>
     </w:p>
     <w:p>
@@ -4020,7 +4149,7 @@
         <w:pStyle w:val="ListBullet"/>
       </w:pPr>
       <w:r>
-        <w:t>staff.html (Kitchen display system)</w:t>
+        <w:t>staff.html (Staff dashboard — preparation stations)</w:t>
       </w:r>
     </w:p>
     <w:sectPr>

</xml_diff>

<commit_message>
Fix architecture documentation: Lambda Function URL vs API Gateway
Key corrections across Notion and .docx:
- Node.js Lambda uses Lambda Function URL, NOT API Gateway
- Only Java SAM service uses API Gateway (SAM-generated ServerlessRestApi)
- index.mjs + db.mjs are Lambda runtime code, NOT provisioning scripts
- Architecture table split: "Menu Management Backend" + "Order Service Backend"
- Fixed endpoint names: /get-full-data and /save-menu (not /get-data, /save-data)
- Fixed Epic 3 in Notion 00_Master (was still old text)
- Rewrote Notion 02_Cloud_Architecture with correct two-Lambda-system description

https://claude.ai/code/session_012EnbcGysqnXYyyDPBp4QjE
</commit_message>
<xml_diff>
--- a/QR_Menu_Platform_Documentation.docx
+++ b/QR_Menu_Platform_Documentation.docx
@@ -312,7 +312,7 @@
     </w:p>
     <w:p>
       <w:r>
-        <w:t>The customer scans a QR code placed at their table. This opens a static web application in their mobile browser showing the shop-specific menu. When they are ready to order, they press the "START ORDER" button embedded in the menu UI. This redirects them to app.html — a "chameleon" ordering page that inherits UI elements (theme, colors, branding) from the currently running menu. There, they enter their table number, build their order, and submit it. The order is sent as a POST request to the AWS API Gateway, which invokes the CreateOrderHandler Lambda function. The order source is tagged as CUSTOMER_QR.</w:t>
+        <w:t>The customer scans a QR code placed at their table. This opens a static web application in their mobile browser showing the shop-specific menu. When they are ready to order, they press the "START ORDER" button embedded in the menu UI. This redirects them to app.html — a "chameleon" ordering page that inherits UI elements (theme, colors, branding) from the currently running menu. There, they enter their table number, build their order, and submit it. The order is sent as a POST request to the Java order-service API Gateway (SAM-generated), which invokes the CreateOrderHandler Lambda function. The order source is tagged as CUSTOMER_QR.</w:t>
       </w:r>
     </w:p>
     <w:p>
@@ -676,7 +676,39 @@
           </w:tcPr>
           <w:p>
             <w:r>
-              <w:t>Core Backend (API)</w:t>
+              <w:t>Menu Management Backend</w:t>
+            </w:r>
+          </w:p>
+        </w:tc>
+        <w:tc>
+          <w:tcPr>
+            <w:tcW w:type="dxa" w:w="2880"/>
+          </w:tcPr>
+          <w:p>
+            <w:r>
+              <w:t>Node.js 20, Lambda Function URL, Terraform</w:t>
+            </w:r>
+          </w:p>
+        </w:tc>
+        <w:tc>
+          <w:tcPr>
+            <w:tcW w:type="dxa" w:w="2880"/>
+          </w:tcPr>
+          <w:p>
+            <w:r>
+              <w:t>menu-backend-CICD-Automation</w:t>
+            </w:r>
+          </w:p>
+        </w:tc>
+      </w:tr>
+      <w:tr>
+        <w:tc>
+          <w:tcPr>
+            <w:tcW w:type="dxa" w:w="2880"/>
+          </w:tcPr>
+          <w:p>
+            <w:r>
+              <w:t>Order Service Backend</w:t>
             </w:r>
           </w:p>
         </w:tc>
@@ -706,31 +738,19 @@
           <w:tcPr>
             <w:tcW w:type="dxa" w:w="2880"/>
           </w:tcPr>
-          <w:p>
-            <w:r>
-              <w:t>Infrastructure &amp; CI/CD</w:t>
-            </w:r>
-          </w:p>
+          <w:p/>
         </w:tc>
         <w:tc>
           <w:tcPr>
             <w:tcW w:type="dxa" w:w="2880"/>
           </w:tcPr>
-          <w:p>
-            <w:r>
-              <w:t>Terraform, Node.js Lambda, GitHub Actions</w:t>
-            </w:r>
-          </w:p>
+          <w:p/>
         </w:tc>
         <w:tc>
           <w:tcPr>
             <w:tcW w:type="dxa" w:w="2880"/>
           </w:tcPr>
-          <w:p>
-            <w:r>
-              <w:t>menu-backend-CICD-Automation</w:t>
-            </w:r>
-          </w:p>
+          <w:p/>
         </w:tc>
       </w:tr>
     </w:tbl>
@@ -745,12 +765,12 @@
     </w:p>
     <w:p>
       <w:r>
-        <w:t>The flow works as follows: (1) The Customer opens the static menu website hosted on S3/CloudFront. (2) They browse the menu by fetching data from the GetMenuHandler Lambda via API Gateway. (3) They press "START ORDER" and are redirected to app.html, a chameleon page that inherits the menu's UI theme. (4) Upon order submission, a POST hits CreateOrderHandler, which writes to DynamoDB with status=NEW. (5) The staff dashboard (staff.html) polls GetOrdersHandler and displays orders per station. (6) Bar/Kitchen stations see their filtered items and mark them done (action=ITEM_DONE). (7) When all items are done, the order becomes READY and the waiter is notified. (8) The waiter closes the order (action=CLOSE) after payment. Separately, the business owner uses the MenuAdmin React Native app to manage the menu and (in the future) view analytics, track income/expenses, and manage inventory.</w:t>
-      </w:r>
-    </w:p>
-    <w:p>
-      <w:r>
-        <w:t>Additionally, there is a parallel Node.js Lambda (index.mjs in menu-backend-CICD-Automation) that handles the menu management backend — login, get-data, save-data, and S3 file serving for the template-based frontend. This Lambda communicates with the same DynamoDB "Menus" table.</w:t>
+        <w:t>The flow works as follows: (1) The Customer opens the static menu website hosted on S3/CloudFront. (2) The Node.js Lambda fetches shop data from DynamoDB and injects it into the HTML as window.SHOP_DATA before serving. (3) They press "START ORDER" and are redirected to app.html, a chameleon page that inherits the menu's UI theme. (4) Upon order submission, a POST hits CreateOrderHandler, which writes to DynamoDB with status=NEW. (5) The staff dashboard (staff.html) polls GetOrdersHandler and displays orders per station. (6) Bar/Kitchen stations see their filtered items and mark them done (action=ITEM_DONE). (7) When all items are done, the order becomes READY and the waiter is notified. (8) The waiter closes the order (action=CLOSE) after payment. Separately, the business owner uses the MenuAdmin React Native app to manage the menu and (in the future) view analytics, track income/expenses, and manage inventory.</w:t>
+      </w:r>
+    </w:p>
+    <w:p>
+      <w:r>
+        <w:t>The two backend systems are independent: The Node.js Lambda ("qr-menu") handles menu management, owner authentication, and S3 template serving via a Lambda Function URL (no API Gateway). The Java Lambdas (SAM) handle order processing via a SAM-generated API Gateway. Both share the same DynamoDB "Menus" table.</w:t>
       </w:r>
     </w:p>
     <w:p>
@@ -795,7 +815,21 @@
         <w:t xml:space="preserve">API Gateway: </w:t>
       </w:r>
       <w:r>
-        <w:t>API Gateway: Routes RESTful endpoints (/orders, /menu, /orders/status). Handles CORS headers for cross-origin browser requests.</w:t>
+        <w:t>API Gateway (Java/SAM only): SAM-generated ServerlessRestApi that routes order-service endpoints (/orders, /menu, /orders/status). Handles CORS. Used ONLY by the Java order-service, NOT by the Node.js Lambda.</w:t>
+      </w:r>
+    </w:p>
+    <w:p>
+      <w:pPr>
+        <w:pStyle w:val="ListBullet"/>
+      </w:pPr>
+      <w:r>
+        <w:rPr>
+          <w:b/>
+        </w:rPr>
+        <w:t xml:space="preserve">Lambda Function URL: </w:t>
+      </w:r>
+      <w:r>
+        <w:t>Lambda Function URL (Node.js): The Node.js Lambda ("qr-menu") is invoked directly via a Lambda Function URL, bypassing API Gateway entirely. This is used by the customer template serving and the MenuAdmin app.</w:t>
       </w:r>
     </w:p>
     <w:p>
@@ -809,7 +843,7 @@
         <w:t xml:space="preserve">AWS Lambda (Java): </w:t>
       </w:r>
       <w:r>
-        <w:t>AWS Lambda (Java 17 / SAM): Executes business logic. Four handler functions deployed as individual Lambda resources via SAM template.yaml.</w:t>
+        <w:t>AWS Lambda — Java 17 (SAM): Simple Java with no framework. Four handler functions deployed as individual Lambda resources via SAM template.yaml. Deployed via AWS SAM CLI (sam build / sam deploy).</w:t>
       </w:r>
     </w:p>
     <w:p>
@@ -823,7 +857,7 @@
         <w:t xml:space="preserve">AWS Lambda (Node.js): </w:t>
       </w:r>
       <w:r>
-        <w:t>AWS Lambda (Node.js 20): The menu management Lambda (index.mjs). Deployed via Terraform. Handles admin login, menu CRUD, and S3 template serving.</w:t>
+        <w:t>AWS Lambda — Node.js 20 (Terraform): The menu management Lambda (index.mjs + db.mjs). Deployed via Terraform. Handles owner auth, menu CRUD, and S3 template serving.</w:t>
       </w:r>
     </w:p>
     <w:p>
@@ -2642,7 +2676,7 @@
         <w:t xml:space="preserve">api.getMenuData(): </w:t>
       </w:r>
       <w:r>
-        <w:t>getMenuData(shop_id, password): POST /get-data — Returns full shop JSON (menu, settings)</w:t>
+        <w:t>getMenuData(shop_id, password): POST /get-full-data via Lambda Function URL — Returns full shop JSON (menu, settings)</w:t>
       </w:r>
     </w:p>
     <w:p>
@@ -2656,7 +2690,7 @@
         <w:t xml:space="preserve">api.saveMenuData(): </w:t>
       </w:r>
       <w:r>
-        <w:t>saveMenuData(shop_id, password, newData): POST /save-data — Persists updated menu to DynamoDB</w:t>
+        <w:t>saveMenuData(shop_id, password, newData): POST /save-menu via Lambda Function URL — Persists updated menu to DynamoDB</w:t>
       </w:r>
     </w:p>
     <w:p>
@@ -2917,7 +2951,12 @@
         <w:pStyle w:val="Heading2"/>
       </w:pPr>
       <w:r>
-        <w:t>10.2 Database Provisioning Scripts</w:t>
+        <w:t>10.2 Lambda Runtime Source Code</w:t>
+      </w:r>
+    </w:p>
+    <w:p>
+      <w:r>
+        <w:t>These files are NOT provisioning or configuration scripts. They are the runtime source code of the Node.js Lambda function ("qr-menu") and are deployed as the Lambda's code package via Terraform.</w:t>
       </w:r>
     </w:p>
     <w:p>
@@ -3479,7 +3518,7 @@
         <w:t xml:space="preserve">Step 2: </w:t>
       </w:r>
       <w:r>
-        <w:t>MenuDashboard calls api.getMenuData() -&gt; POST /get-data to Node.js Lambda</w:t>
+        <w:t>MenuDashboard calls api.getMenuData() -&gt; POST /get-full-data to Node.js Lambda via Function URL</w:t>
       </w:r>
     </w:p>
     <w:p>
@@ -3521,7 +3560,7 @@
         <w:t xml:space="preserve">Step 5: </w:t>
       </w:r>
       <w:r>
-        <w:t>On save, api.saveMenuData() -&gt; POST /save-data to Node.js Lambda</w:t>
+        <w:t>On save, api.saveMenuData() -&gt; POST /save-menu to Node.js Lambda via Function URL</w:t>
       </w:r>
     </w:p>
     <w:p>

</xml_diff>

<commit_message>
Update documentation: Epic 1 & 2 now Done, reflect implemented backend features
- Section 6.1: CreateOrderHandler now sets defaults (status=NEW, paymentStatus=UNPAID, claimedBy=NONE), validates station, supports WAITER_PDA source
- Section 6.3: UpdateOrderStatusHandler fully rewritten with action-based switch routing (CLAIM, ITEM_DONE, APPEND, CLOSE) and read-modify-write pattern
- Section 6.5: Added OrderUpdateRequest.java model, updated Order/OrderItem with implemented fields
- Section 6.6: SAM template updated (global CORS, DynamoDBCrudPolicy, CodeUri=".")
- Section 8.2: Staff dashboard dark theme matching MenuAdmin, shared screen organization
- Section 10.1: Fixed Terraform S3 bucket name (qr-menu-terraform-state-2026)
- Section 11.2: Updated CI/CD to match current deploy.yml (no -target for dev)
- Section 13: Epic 1 and Epic 2 status changed to Done
- Notion pages 00 and 01 also updated

https://claude.ai/code/session_012EnbcGysqnXYyyDPBp4QjE
</commit_message>
<xml_diff>
--- a/QR_Menu_Platform_Documentation.docx
+++ b/QR_Menu_Platform_Documentation.docx
@@ -42,7 +42,7 @@
         <w:rPr>
           <w:sz w:val="22"/>
         </w:rPr>
-        <w:t>Version 1.0 — March 06, 2026</w:t>
+        <w:t>Version 1.0 — March 08, 2026</w:t>
       </w:r>
     </w:p>
     <w:p>
@@ -1691,12 +1691,12 @@
     </w:p>
     <w:p>
       <w:r>
-        <w:t>Receives a new order from the customer web app. The handler deserializes the JSON body into an Order object, validates that shopId exists, then enriches the order with a generated composite orderId (format: ORDER#&lt;ISO_TIMESTAMP&gt;#&lt;UUID&gt;), a createdAt timestamp, and a default status of "NEW". It maps the Order fields to DynamoDB AttributeValue objects and stores the items array as a JSON string in a single DynamoDB attribute for simplicity. Returns 201 with the generated orderId.</w:t>
-      </w:r>
-    </w:p>
-    <w:p>
-      <w:r>
-        <w:t>Key code reference — orderId generation:</w:t>
+        <w:t>Receives a new order from the customer web app (source=CUSTOMER_QR) or from a waiter's PDA (source=WAITER_PDA). The handler deserializes the JSON body into an Order object, validates that shopId exists, then sets default state values: status="NEW", paymentStatus="UNPAID", claimedBy="NONE". If source is not provided, it defaults to "CUSTOMER_QR". It loops through all order items and sets itemStatus="PENDING" and timestamp=current ISO timestamp. Station validation: if any item has a null/empty station field, it defaults to "KITCHEN" as a fail-safe. Similarly, if productId is null, the item name is used as a fallback ID. The handler then generates a composite orderId (ORDER#&lt;ISO_TIMESTAMP&gt;#&lt;UUID&gt;), maps all fields to DynamoDB AttributeValue objects, and stores the items array as a JSON string. Returns 201 with the generated orderId.</w:t>
+      </w:r>
+    </w:p>
+    <w:p>
+      <w:r>
+        <w:t>Key code reference — Default state initialization and station validation:</w:t>
       </w:r>
     </w:p>
     <w:p>
@@ -1704,7 +1704,7 @@
         <w:pStyle w:val="CodeBlock"/>
       </w:pPr>
       <w:r>
-        <w:t>String uniqueId = UUID.randomUUID().toString();</w:t>
+        <w:t>// Default state values</w:t>
       </w:r>
     </w:p>
     <w:p>
@@ -1712,7 +1712,7 @@
         <w:pStyle w:val="CodeBlock"/>
       </w:pPr>
       <w:r>
-        <w:t>String timestamp = Instant.now().toString();</w:t>
+        <w:t>newOrder.setStatus("NEW");</w:t>
       </w:r>
     </w:p>
     <w:p>
@@ -1720,7 +1720,108 @@
         <w:pStyle w:val="CodeBlock"/>
       </w:pPr>
       <w:r>
-        <w:t>String generatedOrderId = "ORDER#" + timestamp + "#" + uniqueId;</w:t>
+        <w:t>newOrder.setPaymentStatus("UNPAID");</w:t>
+      </w:r>
+    </w:p>
+    <w:p>
+      <w:pPr>
+        <w:pStyle w:val="CodeBlock"/>
+      </w:pPr>
+      <w:r>
+        <w:t>newOrder.setClaimedBy("NONE");</w:t>
+      </w:r>
+    </w:p>
+    <w:p>
+      <w:pPr>
+        <w:pStyle w:val="CodeBlock"/>
+      </w:pPr>
+      <w:r>
+        <w:t>if (newOrder.getSource() == null) {</w:t>
+      </w:r>
+    </w:p>
+    <w:p>
+      <w:pPr>
+        <w:pStyle w:val="CodeBlock"/>
+      </w:pPr>
+      <w:r>
+        <w:t xml:space="preserve">    newOrder.setSource("CUSTOMER_QR");</w:t>
+      </w:r>
+    </w:p>
+    <w:p>
+      <w:pPr>
+        <w:pStyle w:val="CodeBlock"/>
+      </w:pPr>
+      <w:r>
+        <w:t>}</w:t>
+      </w:r>
+    </w:p>
+    <w:p>
+      <w:pPr>
+        <w:pStyle w:val="CodeBlock"/>
+      </w:pPr>
+    </w:p>
+    <w:p>
+      <w:pPr>
+        <w:pStyle w:val="CodeBlock"/>
+      </w:pPr>
+      <w:r>
+        <w:t>// Per-item initialization</w:t>
+      </w:r>
+    </w:p>
+    <w:p>
+      <w:pPr>
+        <w:pStyle w:val="CodeBlock"/>
+      </w:pPr>
+      <w:r>
+        <w:t>for (OrderItem item : newOrder.getOrderItem()) {</w:t>
+      </w:r>
+    </w:p>
+    <w:p>
+      <w:pPr>
+        <w:pStyle w:val="CodeBlock"/>
+      </w:pPr>
+      <w:r>
+        <w:t xml:space="preserve">    item.setItemStatus("PENDING");</w:t>
+      </w:r>
+    </w:p>
+    <w:p>
+      <w:pPr>
+        <w:pStyle w:val="CodeBlock"/>
+      </w:pPr>
+      <w:r>
+        <w:t xml:space="preserve">    item.setTimestamp(currentTimestamp);</w:t>
+      </w:r>
+    </w:p>
+    <w:p>
+      <w:pPr>
+        <w:pStyle w:val="CodeBlock"/>
+      </w:pPr>
+      <w:r>
+        <w:t xml:space="preserve">    if (item.getStation() == null || item.getStation().trim().isEmpty()) {</w:t>
+      </w:r>
+    </w:p>
+    <w:p>
+      <w:pPr>
+        <w:pStyle w:val="CodeBlock"/>
+      </w:pPr>
+      <w:r>
+        <w:t xml:space="preserve">        item.setStation("KITCHEN"); // Fail-safe default</w:t>
+      </w:r>
+    </w:p>
+    <w:p>
+      <w:pPr>
+        <w:pStyle w:val="CodeBlock"/>
+      </w:pPr>
+      <w:r>
+        <w:t xml:space="preserve">    }</w:t>
+      </w:r>
+    </w:p>
+    <w:p>
+      <w:pPr>
+        <w:pStyle w:val="CodeBlock"/>
+      </w:pPr>
+      <w:r>
+        <w:t>}</w:t>
       </w:r>
     </w:p>
     <w:p>
@@ -1819,7 +1920,7 @@
     </w:p>
     <w:p>
       <w:r>
-        <w:t>This handler acts as a "router" for order state transitions. Currently, it receives a simple status update payload (shopId, orderId, status) and performs a DynamoDB UpdateItem to change the status field. Per the business plan, this handler is slated for expansion (Epic 2) to support an action-based payload model with the following actions:</w:t>
+        <w:t>This handler acts as the central "router" for all order state transitions. It receives an OrderUpdateRequest JSON payload containing an action field and executes the appropriate business logic via a switch statement. The handler uses a full read-modify-write pattern: it first fetches the current order from DynamoDB (GetItem), deserializes the items JSON array, applies the mutation, then writes the entire modified item back (PutItem). This is necessary because actions like ITEM_DONE and APPEND need to read and modify the items array.</w:t>
       </w:r>
     </w:p>
     <w:p>
@@ -1833,7 +1934,7 @@
         <w:t xml:space="preserve">ACTION CLAIM: </w:t>
       </w:r>
       <w:r>
-        <w:t>CLAIM: Sets claimedBy = employeeName, status = CLAIMED</w:t>
+        <w:t>CLAIM: Sets status=CLAIMED, claimedBy=employeeName. The waiter takes ownership of the order.</w:t>
       </w:r>
     </w:p>
     <w:p>
@@ -1847,7 +1948,7 @@
         <w:t xml:space="preserve">ACTION ITEM_DONE: </w:t>
       </w:r>
       <w:r>
-        <w:t>ITEM_DONE: Sets a specific item's itemStatus = DONE. If all items are DONE, sets parent status = READY</w:t>
+        <w:t>ITEM_DONE: Matches a specific item by productId + itemTimestamp (dual key for disambiguation when the same product appears multiple times). Sets that item's itemStatus=DONE. If ALL items in the order are now DONE, sets parent status=READY. Otherwise sets status=PARTIAL.</w:t>
       </w:r>
     </w:p>
     <w:p>
@@ -1861,7 +1962,7 @@
         <w:t xml:space="preserve">ACTION APPEND: </w:t>
       </w:r>
       <w:r>
-        <w:t>APPEND: Adds new items to the array. Drops parent status back to CLAIMED/PARTIAL</w:t>
+        <w:t>APPEND: Adds newItems (List&lt;OrderItem&gt;) to the existing items array. Resets parent status to CLAIMED so kitchen/bar sees the new ticket.</w:t>
       </w:r>
     </w:p>
     <w:p>
@@ -1875,12 +1976,12 @@
         <w:t xml:space="preserve">ACTION CLOSE: </w:t>
       </w:r>
       <w:r>
-        <w:t>CLOSE: Sets status = CLOSED, paymentStatus = PAID</w:t>
-      </w:r>
-    </w:p>
-    <w:p>
-      <w:r>
-        <w:t>Planned Action Payload Model (OrderUpdateRequest):</w:t>
+        <w:t>CLOSE: Sets status=CLOSED, paymentStatus=PAID. Order is archived.</w:t>
+      </w:r>
+    </w:p>
+    <w:p>
+      <w:r>
+        <w:t>Action Payload Model (OrderUpdateRequest.java):</w:t>
       </w:r>
     </w:p>
     <w:p>
@@ -1904,7 +2005,7 @@
         <w:pStyle w:val="CodeBlock"/>
       </w:pPr>
       <w:r>
-        <w:t xml:space="preserve">  "orderId": "ORDER#123",</w:t>
+        <w:t xml:space="preserve">  "orderId": "ORDER#2026-03-01T10:15:30Z#abc123",</w:t>
       </w:r>
     </w:p>
     <w:p>
@@ -1912,7 +2013,7 @@
         <w:pStyle w:val="CodeBlock"/>
       </w:pPr>
       <w:r>
-        <w:t xml:space="preserve">  "action": "CLAIM",</w:t>
+        <w:t xml:space="preserve">  "action": "CLAIM",        // CLAIM | ITEM_DONE | APPEND | CLOSE</w:t>
       </w:r>
     </w:p>
     <w:p>
@@ -1920,7 +2021,7 @@
         <w:pStyle w:val="CodeBlock"/>
       </w:pPr>
       <w:r>
-        <w:t xml:space="preserve">  "employeeName": "George",</w:t>
+        <w:t xml:space="preserve">  "employeeName": "George",  // Used by CLAIM</w:t>
       </w:r>
     </w:p>
     <w:p>
@@ -1928,7 +2029,7 @@
         <w:pStyle w:val="CodeBlock"/>
       </w:pPr>
       <w:r>
-        <w:t xml:space="preserve">  "productId": "burger_01",</w:t>
+        <w:t xml:space="preserve">  "productId": "burger_01",  // Used by ITEM_DONE</w:t>
       </w:r>
     </w:p>
     <w:p>
@@ -1936,7 +2037,7 @@
         <w:pStyle w:val="CodeBlock"/>
       </w:pPr>
       <w:r>
-        <w:t xml:space="preserve">  "newItems": []</w:t>
+        <w:t xml:space="preserve">  "itemTimestamp": "2026-03-01T10:15:30Z",  // Used by ITEM_DONE (dual key)</w:t>
       </w:r>
     </w:p>
     <w:p>
@@ -1944,7 +2045,265 @@
         <w:pStyle w:val="CodeBlock"/>
       </w:pPr>
       <w:r>
+        <w:t xml:space="preserve">  "newItems": []              // Used by APPEND</w:t>
+      </w:r>
+    </w:p>
+    <w:p>
+      <w:pPr>
+        <w:pStyle w:val="CodeBlock"/>
+      </w:pPr>
+      <w:r>
         <w:t>}</w:t>
+      </w:r>
+    </w:p>
+    <w:p>
+      <w:r>
+        <w:t>Key code reference — Action-based switch routing:</w:t>
+      </w:r>
+    </w:p>
+    <w:p>
+      <w:pPr>
+        <w:pStyle w:val="CodeBlock"/>
+      </w:pPr>
+      <w:r>
+        <w:t>OrderUpdateRequest updateReq = gson.fromJson(request.getBody(), OrderUpdateRequest.class);</w:t>
+      </w:r>
+    </w:p>
+    <w:p>
+      <w:pPr>
+        <w:pStyle w:val="CodeBlock"/>
+      </w:pPr>
+      <w:r>
+        <w:t>// GetItem -&gt; read current state</w:t>
+      </w:r>
+    </w:p>
+    <w:p>
+      <w:pPr>
+        <w:pStyle w:val="CodeBlock"/>
+      </w:pPr>
+      <w:r>
+        <w:t>GetItemResponse getResponse = dynamoDb.getItem(getItemRequest);</w:t>
+      </w:r>
+    </w:p>
+    <w:p>
+      <w:pPr>
+        <w:pStyle w:val="CodeBlock"/>
+      </w:pPr>
+      <w:r>
+        <w:t>List&lt;OrderItem&gt; currentItems = gson.fromJson(currentItemsJson, listType);</w:t>
+      </w:r>
+    </w:p>
+    <w:p>
+      <w:pPr>
+        <w:pStyle w:val="CodeBlock"/>
+      </w:pPr>
+    </w:p>
+    <w:p>
+      <w:pPr>
+        <w:pStyle w:val="CodeBlock"/>
+      </w:pPr>
+      <w:r>
+        <w:t>switch (action.toUpperCase()) {</w:t>
+      </w:r>
+    </w:p>
+    <w:p>
+      <w:pPr>
+        <w:pStyle w:val="CodeBlock"/>
+      </w:pPr>
+      <w:r>
+        <w:t xml:space="preserve">    case "CLAIM":</w:t>
+      </w:r>
+    </w:p>
+    <w:p>
+      <w:pPr>
+        <w:pStyle w:val="CodeBlock"/>
+      </w:pPr>
+      <w:r>
+        <w:t xml:space="preserve">        item.put("status", AttributeValue.builder().s("CLAIMED").build());</w:t>
+      </w:r>
+    </w:p>
+    <w:p>
+      <w:pPr>
+        <w:pStyle w:val="CodeBlock"/>
+      </w:pPr>
+      <w:r>
+        <w:t xml:space="preserve">        item.put("claimedBy", AttributeValue.builder().s(updateReq.getEmployeeName()).build());</w:t>
+      </w:r>
+    </w:p>
+    <w:p>
+      <w:pPr>
+        <w:pStyle w:val="CodeBlock"/>
+      </w:pPr>
+      <w:r>
+        <w:t xml:space="preserve">        break;</w:t>
+      </w:r>
+    </w:p>
+    <w:p>
+      <w:pPr>
+        <w:pStyle w:val="CodeBlock"/>
+      </w:pPr>
+      <w:r>
+        <w:t xml:space="preserve">    case "ITEM_DONE":</w:t>
+      </w:r>
+    </w:p>
+    <w:p>
+      <w:pPr>
+        <w:pStyle w:val="CodeBlock"/>
+      </w:pPr>
+      <w:r>
+        <w:t xml:space="preserve">        // Match by productId + itemTimestamp</w:t>
+      </w:r>
+    </w:p>
+    <w:p>
+      <w:pPr>
+        <w:pStyle w:val="CodeBlock"/>
+      </w:pPr>
+      <w:r>
+        <w:t xml:space="preserve">        for (OrderItem oi : currentItems) {</w:t>
+      </w:r>
+    </w:p>
+    <w:p>
+      <w:pPr>
+        <w:pStyle w:val="CodeBlock"/>
+      </w:pPr>
+      <w:r>
+        <w:t xml:space="preserve">            if (oi.getProductId().equals(updateReq.getProductId()) &amp;&amp;</w:t>
+      </w:r>
+    </w:p>
+    <w:p>
+      <w:pPr>
+        <w:pStyle w:val="CodeBlock"/>
+      </w:pPr>
+      <w:r>
+        <w:t xml:space="preserve">                oi.getTimestamp().equals(updateReq.getItemTimestamp())) {</w:t>
+      </w:r>
+    </w:p>
+    <w:p>
+      <w:pPr>
+        <w:pStyle w:val="CodeBlock"/>
+      </w:pPr>
+      <w:r>
+        <w:t xml:space="preserve">                oi.setItemStatus("DONE");</w:t>
+      </w:r>
+    </w:p>
+    <w:p>
+      <w:pPr>
+        <w:pStyle w:val="CodeBlock"/>
+      </w:pPr>
+      <w:r>
+        <w:t xml:space="preserve">            }</w:t>
+      </w:r>
+    </w:p>
+    <w:p>
+      <w:pPr>
+        <w:pStyle w:val="CodeBlock"/>
+      </w:pPr>
+      <w:r>
+        <w:t xml:space="preserve">        }</w:t>
+      </w:r>
+    </w:p>
+    <w:p>
+      <w:pPr>
+        <w:pStyle w:val="CodeBlock"/>
+      </w:pPr>
+      <w:r>
+        <w:t xml:space="preserve">        currentStatus = allDone ? "READY" : "PARTIAL";</w:t>
+      </w:r>
+    </w:p>
+    <w:p>
+      <w:pPr>
+        <w:pStyle w:val="CodeBlock"/>
+      </w:pPr>
+      <w:r>
+        <w:t xml:space="preserve">        break;</w:t>
+      </w:r>
+    </w:p>
+    <w:p>
+      <w:pPr>
+        <w:pStyle w:val="CodeBlock"/>
+      </w:pPr>
+      <w:r>
+        <w:t xml:space="preserve">    case "APPEND":</w:t>
+      </w:r>
+    </w:p>
+    <w:p>
+      <w:pPr>
+        <w:pStyle w:val="CodeBlock"/>
+      </w:pPr>
+      <w:r>
+        <w:t xml:space="preserve">        currentItems.addAll(updateReq.getNewItems());</w:t>
+      </w:r>
+    </w:p>
+    <w:p>
+      <w:pPr>
+        <w:pStyle w:val="CodeBlock"/>
+      </w:pPr>
+      <w:r>
+        <w:t xml:space="preserve">        item.put("status", AttributeValue.builder().s("CLAIMED").build());</w:t>
+      </w:r>
+    </w:p>
+    <w:p>
+      <w:pPr>
+        <w:pStyle w:val="CodeBlock"/>
+      </w:pPr>
+      <w:r>
+        <w:t xml:space="preserve">        break;</w:t>
+      </w:r>
+    </w:p>
+    <w:p>
+      <w:pPr>
+        <w:pStyle w:val="CodeBlock"/>
+      </w:pPr>
+      <w:r>
+        <w:t xml:space="preserve">    case "CLOSE":</w:t>
+      </w:r>
+    </w:p>
+    <w:p>
+      <w:pPr>
+        <w:pStyle w:val="CodeBlock"/>
+      </w:pPr>
+      <w:r>
+        <w:t xml:space="preserve">        item.put("status", AttributeValue.builder().s("CLOSED").build());</w:t>
+      </w:r>
+    </w:p>
+    <w:p>
+      <w:pPr>
+        <w:pStyle w:val="CodeBlock"/>
+      </w:pPr>
+      <w:r>
+        <w:t xml:space="preserve">        item.put("paymentStatus", AttributeValue.builder().s("PAID").build());</w:t>
+      </w:r>
+    </w:p>
+    <w:p>
+      <w:pPr>
+        <w:pStyle w:val="CodeBlock"/>
+      </w:pPr>
+      <w:r>
+        <w:t xml:space="preserve">        break;</w:t>
+      </w:r>
+    </w:p>
+    <w:p>
+      <w:pPr>
+        <w:pStyle w:val="CodeBlock"/>
+      </w:pPr>
+      <w:r>
+        <w:t>}</w:t>
+      </w:r>
+    </w:p>
+    <w:p>
+      <w:pPr>
+        <w:pStyle w:val="CodeBlock"/>
+      </w:pPr>
+      <w:r>
+        <w:t>// PutItem -&gt; write modified state back</w:t>
+      </w:r>
+    </w:p>
+    <w:p>
+      <w:pPr>
+        <w:pStyle w:val="CodeBlock"/>
+      </w:pPr>
+      <w:r>
+        <w:t>dynamoDb.putItem(putRequest);</w:t>
       </w:r>
     </w:p>
     <w:p>
@@ -1985,12 +2344,17 @@
           <w:color w:val="555555"/>
           <w:sz w:val="20"/>
         </w:rPr>
-        <w:t>Files: Order.java, OrderItem.java</w:t>
-      </w:r>
-    </w:p>
-    <w:p>
-      <w:r>
-        <w:t>The Order model contains: shopId, orderId, tableNumber, orderItem (List&lt;OrderItem&gt;), totalAmount, status, source, and createdAt. The OrderItem model contains: productId, name, quantity, unitPrice, and modifiers (List&lt;String&gt;). Per the planned schema (Epic 1), these models will be extended with: station, itemStatus, claimedBy, paymentStatus fields.</w:t>
+        <w:t>Files: Order.java, OrderItem.java, OrderUpdateRequest.java</w:t>
+      </w:r>
+    </w:p>
+    <w:p>
+      <w:r>
+        <w:t>The Order model contains: shopId, orderId, tableNumber, orderItem (List&lt;OrderItem&gt;), totalAmount, status, source, createdAt, claimedBy (String — waiter name or "NONE"), and paymentStatus (String — UNPAID or PAID). The OrderItem model contains: productId, name, quantity, unitPrice, modifiers (List&lt;String&gt;), station (String — BAR or KITCHEN), itemStatus (String — PENDING or DONE), and timestamp (String — ISO 8601, used to disambiguate identical products in the same order).</w:t>
+      </w:r>
+    </w:p>
+    <w:p>
+      <w:r>
+        <w:t>The OrderUpdateRequest model (new) is the payload for UpdateOrderStatusHandler: shopId, orderId, action (CLAIM/ITEM_DONE/APPEND/CLOSE), employeeName (for CLAIM), productId + itemTimestamp (for ITEM_DONE), and newItems (List&lt;OrderItem&gt; for APPEND).</w:t>
       </w:r>
     </w:p>
     <w:p>
@@ -2021,6 +2385,14 @@
         <w:pStyle w:val="ListBullet"/>
       </w:pPr>
       <w:r>
+        <w:t>Global CORS configuration: AllowMethods, AllowHeaders, AllowOrigin="*" — applied to all API endpoints</w:t>
+      </w:r>
+    </w:p>
+    <w:p>
+      <w:pPr>
+        <w:pStyle w:val="ListBullet"/>
+      </w:pPr>
+      <w:r>
         <w:t>Creates the "orders" DynamoDB table with PAY_PER_REQUEST billing (shopId as PK, orderId as SK)</w:t>
       </w:r>
     </w:p>
@@ -2045,7 +2417,15 @@
         <w:pStyle w:val="ListBullet"/>
       </w:pPr>
       <w:r>
-        <w:t>Least-privilege IAM: GetOrders gets DynamoDBReadPolicy, CreateOrder gets DynamoDBCrudPolicy, etc.</w:t>
+        <w:t>Least-privilege IAM: GetOrders and GetMenu get DynamoDBReadPolicy; CreateOrder and UpdateOrderStatus get DynamoDBCrudPolicy (UpdateOrderStatus needs both GetItem and PutItem for read-modify-write)</w:t>
+      </w:r>
+    </w:p>
+    <w:p>
+      <w:pPr>
+        <w:pStyle w:val="ListBullet"/>
+      </w:pPr>
+      <w:r>
+        <w:t>CodeUri set to "." — SAM builds the project from the repository root</w:t>
       </w:r>
     </w:p>
     <w:p>
@@ -2310,12 +2690,17 @@
     </w:p>
     <w:p>
       <w:r>
-        <w:t>This is the staff's primary interface — a real-time web-based dashboard designed for display screens at preparation stations (Bar, Kitchen). Staff do NOT use the React Native mobile app; they use this browser-based dashboard. Each station opens staff.html and sees only the orders relevant to their post. The dashboard polls the GetOrdersHandler (GET /orders?shopId=...) every 10 seconds and renders NEW orders as cards in a responsive grid. Each card shows the table number, timestamp, and ordered items with quantities. Staff press "MARK AS DONE" to send a PATCH request to UpdateOrderStatusHandler, which transitions the order to COMPLETED. The card then fades out of the grid.</w:t>
-      </w:r>
-    </w:p>
-    <w:p>
-      <w:r>
-        <w:t>Key code reference — Polling and status update:</w:t>
+        <w:t>This is the staff's primary interface — a real-time web-based dashboard designed for display screens at preparation stations (Bar, Kitchen). Staff do NOT use the React Native mobile app; they use this browser-based dashboard. The dashboard uses a dark theme (CSS variables: --bg-color: #121212, --surface-color: #1E1E1E, --accent-color: #C4A474) that matches the MenuAdmin React Native app's MD3DarkTheme for visual consistency across the platform. Uses the Manrope font family for a modern, clean look.</w:t>
+      </w:r>
+    </w:p>
+    <w:p>
+      <w:r>
+        <w:t>Each station opens staff.html and sees only the orders relevant to their post. The dashboard polls GetOrdersHandler (GET /orders?shopId=...) every 10 seconds and renders orders as cards in a responsive CSS Grid (auto-fill, minmax 300px). Each card shows the table number, timestamp, and ordered items with quantities. Orders are displayed individually — they do NOT merge even if they are for the same table. CLAIM notifications are shown only to the waiter who claimed the order. Staff press "MARK AS DONE" to send a PATCH request to UpdateOrderStatusHandler with the appropriate action payload.</w:t>
+      </w:r>
+    </w:p>
+    <w:p>
+      <w:r>
+        <w:t>Key code reference — Polling and action-based status update:</w:t>
       </w:r>
     </w:p>
     <w:p>
@@ -2344,7 +2729,7 @@
         <w:pStyle w:val="CodeBlock"/>
       </w:pPr>
       <w:r>
-        <w:t>// Mark as done sends PATCH</w:t>
+        <w:t>// Action-based PATCH (e.g., ITEM_DONE for a specific item)</w:t>
       </w:r>
     </w:p>
     <w:p>
@@ -2352,7 +2737,7 @@
         <w:pStyle w:val="CodeBlock"/>
       </w:pPr>
       <w:r>
-        <w:t>const payload = { shopId, orderId, status: "COMPLETED" };</w:t>
+        <w:t>const payload = { shopId, orderId, action: "ITEM_DONE", productId: "beer_01", itemTimestamp: "..." };</w:t>
       </w:r>
     </w:p>
     <w:p>
@@ -2360,7 +2745,7 @@
         <w:pStyle w:val="CodeBlock"/>
       </w:pPr>
       <w:r>
-        <w:t>fetch(`${API_BASE_URL}/orders/status?shopId=${shopId}`, {</w:t>
+        <w:t>fetch(`${API_BASE_URL}/orders/status`, {</w:t>
       </w:r>
     </w:p>
     <w:p>
@@ -2749,7 +3134,7 @@
         <w:pStyle w:val="ListBullet"/>
       </w:pPr>
       <w:r>
-        <w:t>Backend state stored in S3 (bucket: qr-templates-io, key: terraform/state.tfstate)</w:t>
+        <w:t>Backend state stored in S3 (bucket: qr-menu-terraform-state-2026, key: qr-menu/terraform.tfstate)</w:t>
       </w:r>
     </w:p>
     <w:p>
@@ -3164,7 +3549,7 @@
         <w:pStyle w:val="ListBullet"/>
       </w:pPr>
       <w:r>
-        <w:t>Runs terraform init and terraform apply with the correct -var="env_stage=..." value</w:t>
+        <w:t>Runs terraform init and terraform apply with -var="env_stage=$ENV_NAME"</w:t>
       </w:r>
     </w:p>
     <w:p>
@@ -3172,7 +3557,7 @@
         <w:pStyle w:val="ListBullet"/>
       </w:pPr>
       <w:r>
-        <w:t>For prod: applies the full infrastructure (Lambda code + PROD alias update)</w:t>
+        <w:t>For prod (main branch): publish=true creates a numbered Lambda version, PROD alias updates to new version</w:t>
       </w:r>
     </w:p>
     <w:p>
@@ -3180,7 +3565,7 @@
         <w:pStyle w:val="ListBullet"/>
       </w:pPr>
       <w:r>
-        <w:t>For dev: uses -target=aws_lambda_function.qr_menu to only update the Lambda code, protecting the PROD alias from being changed by development deployments</w:t>
+        <w:t>For dev (dev branch): publish=false uploads code to $LATEST only, PROD alias stays on the old stable version</w:t>
       </w:r>
     </w:p>
     <w:p>
@@ -3193,7 +3578,7 @@
         <w:pStyle w:val="CodeBlock"/>
       </w:pPr>
       <w:r>
-        <w:t>if [[ "${{ env.ENV_NAME }}" == "prod" ]]; then</w:t>
+        <w:t># Set environment based on branch</w:t>
       </w:r>
     </w:p>
     <w:p>
@@ -3201,7 +3586,7 @@
         <w:pStyle w:val="CodeBlock"/>
       </w:pPr>
       <w:r>
-        <w:t xml:space="preserve">  terraform apply -auto-approve -var="env_stage=prod"</w:t>
+        <w:t>if [ "${{ github.ref_name }}" == "main" ]; then</w:t>
       </w:r>
     </w:p>
     <w:p>
@@ -3209,6 +3594,14 @@
         <w:pStyle w:val="CodeBlock"/>
       </w:pPr>
       <w:r>
+        <w:t xml:space="preserve">  echo "ENV_NAME=prod" &gt;&gt; $GITHUB_ENV</w:t>
+      </w:r>
+    </w:p>
+    <w:p>
+      <w:pPr>
+        <w:pStyle w:val="CodeBlock"/>
+      </w:pPr>
+      <w:r>
         <w:t>else</w:t>
       </w:r>
     </w:p>
@@ -3217,7 +3610,7 @@
         <w:pStyle w:val="CodeBlock"/>
       </w:pPr>
       <w:r>
-        <w:t xml:space="preserve">  terraform apply -auto-approve -var="env_stage=dev" -target=aws_lambda_function.qr_menu</w:t>
+        <w:t xml:space="preserve">  echo "ENV_NAME=dev" &gt;&gt; $GITHUB_ENV</w:t>
       </w:r>
     </w:p>
     <w:p>
@@ -3226,6 +3619,27 @@
       </w:pPr>
       <w:r>
         <w:t>fi</w:t>
+      </w:r>
+    </w:p>
+    <w:p>
+      <w:pPr>
+        <w:pStyle w:val="CodeBlock"/>
+      </w:pPr>
+    </w:p>
+    <w:p>
+      <w:pPr>
+        <w:pStyle w:val="CodeBlock"/>
+      </w:pPr>
+      <w:r>
+        <w:t># Apply with environment variable</w:t>
+      </w:r>
+    </w:p>
+    <w:p>
+      <w:pPr>
+        <w:pStyle w:val="CodeBlock"/>
+      </w:pPr>
+      <w:r>
+        <w:t>terraform apply -auto-approve -var="env_stage=${{ env.ENV_NAME }}"</w:t>
       </w:r>
     </w:p>
     <w:p>
@@ -3797,7 +4211,7 @@
         <w:t xml:space="preserve">Status: </w:t>
       </w:r>
       <w:r>
-        <w:t>Status: To Do</w:t>
+        <w:t>Done</w:t>
       </w:r>
     </w:p>
     <w:p>
@@ -3821,7 +4235,7 @@
         <w:pStyle w:val="ListBullet"/>
       </w:pPr>
       <w:r>
-        <w:t>Code Impact: Extend Order.java and OrderItem.java models. Update CreateOrderHandler to set default values (claimedBy="NONE", paymentStatus="UNPAID", itemStatus="PENDING" for each item).</w:t>
+        <w:t>Implementation: Order.java extended with claimedBy, paymentStatus. OrderItem.java extended with station, itemStatus, timestamp. CreateOrderHandler sets defaults on creation: status="NEW", paymentStatus="UNPAID", claimedBy="NONE", itemStatus="PENDING" per item, station defaults to "KITCHEN" if null.</w:t>
       </w:r>
     </w:p>
     <w:p>
@@ -3843,7 +4257,7 @@
         <w:t xml:space="preserve">Status: </w:t>
       </w:r>
       <w:r>
-        <w:t>Status: To Do</w:t>
+        <w:t>Done</w:t>
       </w:r>
     </w:p>
     <w:p>
@@ -3867,7 +4281,7 @@
         <w:pStyle w:val="ListBullet"/>
       </w:pPr>
       <w:r>
-        <w:t>Code Impact: Major refactoring of UpdateOrderStatusHandler.java — replace the current simple status update with a switch/if-else on the "action" field, implementing distinct DynamoDB update expressions for each action.</w:t>
+        <w:t>Implementation: UpdateOrderStatusHandler.java fully refactored with action-based switch routing. New OrderUpdateRequest.java model handles all action payloads. Uses read-modify-write pattern (GetItem -&gt; modify items array -&gt; PutItem). ITEM_DONE uses productId+itemTimestamp dual key for disambiguation. SAM template updated: DynamoDBCrudPolicy for GetItem+PutItem access, global CORS configuration.</w:t>
       </w:r>
     </w:p>
     <w:p>
@@ -4029,6 +4443,14 @@
       </w:pPr>
       <w:r>
         <w:t>src/main/java/com/qrmenu/orders/models/OrderItem.java</w:t>
+      </w:r>
+    </w:p>
+    <w:p>
+      <w:pPr>
+        <w:pStyle w:val="ListBullet"/>
+      </w:pPr>
+      <w:r>
+        <w:t>src/main/java/com/qrmenu/orders/models/OrderUpdateRequest.java</w:t>
       </w:r>
     </w:p>
     <w:p>

</xml_diff>